<commit_message>
Unify 2021 CAT templates dynamically and make KL/CO edits update TOS in real-time
</commit_message>
<xml_diff>
--- a/backend/templates/cat_2021.docx
+++ b/backend/templates/cat_2021.docx
@@ -6,28 +6,11 @@
       <w:pPr>
         <w:pStyle w:val="BodyText"/>
         <w:spacing w:before="2"/>
+        <w:jc w:val="right"/>
         <w:rPr>
           <w:sz w:val="14"/>
         </w:rPr>
       </w:pPr>
-      <w:r>
-        <w:rPr>
-          <w:sz w:val="14"/>
-        </w:rPr>
-        <w:t xml:space="preserve">                                                                                                                                                                                                                                             </w:t>
-      </w:r>
-      <w:r>
-        <w:rPr>
-          <w:sz w:val="14"/>
-        </w:rPr>
-        <w:t xml:space="preserve">                 </w:t>
-      </w:r>
-      <w:r>
-        <w:rPr>
-          <w:sz w:val="14"/>
-        </w:rPr>
-        <w:t xml:space="preserve">    </w:t>
-      </w:r>
       <w:r>
         <w:rPr>
           <w:sz w:val="28"/>
@@ -296,10 +279,8 @@
             <w:pPr>
               <w:jc w:val="center"/>
             </w:pPr>
-            <w:r/>
-            <w:r>
-              <w:rPr>
-                <w:rFonts w:ascii="Times New Roman" w:hAnsi="Times New Roman"/>
+            <w:r>
+              <w:rPr>
                 <w:b/>
                 <w:sz w:val="28"/>
                 <w:u w:val="single"/>
@@ -1588,6 +1569,7 @@
               </w:rPr>
             </w:pPr>
             <w:proofErr w:type="spellStart"/>
+            <w:proofErr w:type="gramStart"/>
             <w:r>
               <w:rPr>
                 <w:b/>
@@ -1597,6 +1579,7 @@
               <w:t>Q.No</w:t>
             </w:r>
             <w:proofErr w:type="spellEnd"/>
+            <w:proofErr w:type="gramEnd"/>
           </w:p>
           <w:p>
             <w:pPr>
@@ -1803,10 +1786,8 @@
             <w:pPr>
               <w:jc w:val="center"/>
             </w:pPr>
-            <w:r/>
-            <w:r>
-              <w:rPr>
-                <w:rFonts w:ascii="Times New Roman" w:hAnsi="Times New Roman"/>
+            <w:r>
+              <w:rPr>
                 <w:sz w:val="24"/>
               </w:rPr>
               <w:t>CO1</w:t>
@@ -1882,10 +1863,8 @@
             <w:pPr>
               <w:jc w:val="center"/>
             </w:pPr>
-            <w:r/>
-            <w:r>
-              <w:rPr>
-                <w:rFonts w:ascii="Times New Roman" w:hAnsi="Times New Roman"/>
+            <w:r>
+              <w:rPr>
                 <w:sz w:val="24"/>
               </w:rPr>
               <w:t>CO1</w:t>
@@ -1961,10 +1940,8 @@
             <w:pPr>
               <w:jc w:val="center"/>
             </w:pPr>
-            <w:r/>
-            <w:r>
-              <w:rPr>
-                <w:rFonts w:ascii="Times New Roman" w:hAnsi="Times New Roman"/>
+            <w:r>
+              <w:rPr>
                 <w:sz w:val="24"/>
               </w:rPr>
               <w:t>CO1</w:t>
@@ -2038,10 +2015,8 @@
             <w:pPr>
               <w:jc w:val="center"/>
             </w:pPr>
-            <w:r/>
-            <w:r>
-              <w:rPr>
-                <w:rFonts w:ascii="Times New Roman" w:hAnsi="Times New Roman"/>
+            <w:r>
+              <w:rPr>
                 <w:sz w:val="24"/>
               </w:rPr>
               <w:t>CO2</w:t>
@@ -2115,10 +2090,8 @@
             <w:pPr>
               <w:jc w:val="center"/>
             </w:pPr>
-            <w:r/>
-            <w:r>
-              <w:rPr>
-                <w:rFonts w:ascii="Times New Roman" w:hAnsi="Times New Roman"/>
+            <w:r>
+              <w:rPr>
                 <w:sz w:val="24"/>
               </w:rPr>
               <w:t>CO2</w:t>
@@ -2329,6 +2302,7 @@
               </w:rPr>
             </w:pPr>
             <w:proofErr w:type="spellStart"/>
+            <w:proofErr w:type="gramStart"/>
             <w:r>
               <w:rPr>
                 <w:b/>
@@ -2339,6 +2313,7 @@
               <w:t>Q.No</w:t>
             </w:r>
             <w:proofErr w:type="spellEnd"/>
+            <w:proofErr w:type="gramEnd"/>
           </w:p>
         </w:tc>
         <w:tc>
@@ -2568,10 +2543,8 @@
             <w:pPr>
               <w:jc w:val="center"/>
             </w:pPr>
-            <w:r/>
-            <w:r>
-              <w:rPr>
-                <w:rFonts w:ascii="Times New Roman" w:hAnsi="Times New Roman"/>
+            <w:r>
+              <w:rPr>
                 <w:sz w:val="24"/>
               </w:rPr>
               <w:t>CO1</w:t>
@@ -2744,10 +2717,8 @@
             <w:pPr>
               <w:jc w:val="center"/>
             </w:pPr>
-            <w:r/>
-            <w:r>
-              <w:rPr>
-                <w:rFonts w:ascii="Times New Roman" w:hAnsi="Times New Roman"/>
+            <w:r>
+              <w:rPr>
                 <w:sz w:val="24"/>
               </w:rPr>
               <w:t>CO1</w:t>
@@ -2856,10 +2827,8 @@
             <w:pPr>
               <w:jc w:val="center"/>
             </w:pPr>
-            <w:r/>
-            <w:r>
-              <w:rPr>
-                <w:rFonts w:ascii="Times New Roman" w:hAnsi="Times New Roman"/>
+            <w:r>
+              <w:rPr>
                 <w:sz w:val="24"/>
               </w:rPr>
               <w:t>CO2</w:t>
@@ -3029,10 +2998,8 @@
             <w:pPr>
               <w:jc w:val="center"/>
             </w:pPr>
-            <w:r/>
-            <w:r>
-              <w:rPr>
-                <w:rFonts w:ascii="Times New Roman" w:hAnsi="Times New Roman"/>
+            <w:r>
+              <w:rPr>
                 <w:sz w:val="24"/>
               </w:rPr>
               <w:t>CO2</w:t>
@@ -3148,6 +3115,7 @@
               </w:rPr>
             </w:pPr>
             <w:proofErr w:type="spellStart"/>
+            <w:proofErr w:type="gramStart"/>
             <w:r>
               <w:rPr>
                 <w:b/>
@@ -3158,6 +3126,7 @@
               <w:t>Q.No</w:t>
             </w:r>
             <w:proofErr w:type="spellEnd"/>
+            <w:proofErr w:type="gramEnd"/>
           </w:p>
         </w:tc>
         <w:tc>
@@ -3354,10 +3323,8 @@
             <w:pPr>
               <w:jc w:val="center"/>
             </w:pPr>
-            <w:r/>
-            <w:r>
-              <w:rPr>
-                <w:rFonts w:ascii="Times New Roman" w:hAnsi="Times New Roman"/>
+            <w:r>
+              <w:rPr>
                 <w:sz w:val="24"/>
               </w:rPr>
               <w:t>CO1</w:t>
@@ -3530,10 +3497,8 @@
             <w:pPr>
               <w:jc w:val="center"/>
             </w:pPr>
-            <w:r/>
-            <w:r>
-              <w:rPr>
-                <w:rFonts w:ascii="Times New Roman" w:hAnsi="Times New Roman"/>
+            <w:r>
+              <w:rPr>
                 <w:sz w:val="24"/>
               </w:rPr>
               <w:t>CO2</w:t>
@@ -4236,12 +4201,7 @@
             <w:pPr>
               <w:jc w:val="center"/>
             </w:pPr>
-            <w:r/>
-            <w:r>
-              <w:rPr>
-                <w:rFonts w:ascii="Times New Roman" w:hAnsi="Times New Roman"/>
-                <w:sz w:val="22"/>
-              </w:rPr>
+            <w:r>
               <w:t>I</w:t>
             </w:r>
           </w:p>
@@ -4359,12 +4319,7 @@
             <w:pPr>
               <w:jc w:val="center"/>
             </w:pPr>
-            <w:r/>
-            <w:r>
-              <w:rPr>
-                <w:rFonts w:ascii="Times New Roman" w:hAnsi="Times New Roman"/>
-                <w:sz w:val="22"/>
-              </w:rPr>
+            <w:r>
               <w:t>II</w:t>
             </w:r>
           </w:p>
@@ -5283,12 +5238,7 @@
             <w:pPr>
               <w:jc w:val="center"/>
             </w:pPr>
-            <w:r/>
-            <w:r>
-              <w:rPr>
-                <w:rFonts w:ascii="Times New Roman" w:hAnsi="Times New Roman"/>
-                <w:sz w:val="22"/>
-              </w:rPr>
+            <w:r>
               <w:t>I</w:t>
             </w:r>
           </w:p>
@@ -5405,12 +5355,7 @@
             <w:pPr>
               <w:jc w:val="center"/>
             </w:pPr>
-            <w:r/>
-            <w:r>
-              <w:rPr>
-                <w:rFonts w:ascii="Times New Roman" w:hAnsi="Times New Roman"/>
-                <w:sz w:val="22"/>
-              </w:rPr>
+            <w:r>
               <w:t>II</w:t>
             </w:r>
           </w:p>

</xml_diff>